<commit_message>
feat: add sample ISL vocabulary import entries and DAG architectural documentation
</commit_message>
<xml_diff>
--- a/docs/Signify_AI.docx
+++ b/docs/Signify_AI.docx
@@ -338,7 +338,15 @@
     <w:p>
       <w:r>
         <w:lastRenderedPageBreak/>
-        <w:t xml:space="preserve">       [ Sensory Perception ] (Landmark Stream / Audio Stream)</w:t>
+        <w:t xml:space="preserve">       [ Sensory </w:t>
+      </w:r>
+      <w:proofErr w:type="gramStart"/>
+      <w:r>
+        <w:t>Perception ]</w:t>
+      </w:r>
+      <w:proofErr w:type="gramEnd"/>
+      <w:r>
+        <w:t xml:space="preserve"> (Landmark Stream / Audio Stream)</w:t>
       </w:r>
     </w:p>
     <w:p>
@@ -359,7 +367,15 @@
     </w:p>
     <w:p>
       <w:r>
-        <w:t xml:space="preserve">     [ Cognitive Deliberation ] (Consent? → Confidence &gt;= 0.65? → FSM Matrix)</w:t>
+        <w:t xml:space="preserve">     [ Cognitive </w:t>
+      </w:r>
+      <w:proofErr w:type="gramStart"/>
+      <w:r>
+        <w:t>Deliberation ]</w:t>
+      </w:r>
+      <w:proofErr w:type="gramEnd"/>
+      <w:r>
+        <w:t xml:space="preserve"> (Consent? → Confidence &gt;= 0.65? → FSM Matrix)</w:t>
       </w:r>
     </w:p>
     <w:p>
@@ -380,7 +396,15 @@
     </w:p>
     <w:p>
       <w:r>
-        <w:t xml:space="preserve">       [ Autonomous Action ] (Dispatches to Vision, TTS, STT, or ISL </w:t>
+        <w:t xml:space="preserve">       [ Autonomous </w:t>
+      </w:r>
+      <w:proofErr w:type="gramStart"/>
+      <w:r>
+        <w:t>Action ]</w:t>
+      </w:r>
+      <w:proofErr w:type="gramEnd"/>
+      <w:r>
+        <w:t xml:space="preserve"> (Dispatches to Vision, TTS, STT, or ISL </w:t>
       </w:r>
       <w:proofErr w:type="spellStart"/>
       <w:r>
@@ -409,7 +433,15 @@
     </w:p>
     <w:p>
       <w:r>
-        <w:t xml:space="preserve">    [ Epistemic Reflection ] (Debounce check → Hallucination Prevention → Audit Trail)</w:t>
+        <w:t xml:space="preserve">    [ Epistemic </w:t>
+      </w:r>
+      <w:proofErr w:type="gramStart"/>
+      <w:r>
+        <w:t>Reflection ]</w:t>
+      </w:r>
+      <w:proofErr w:type="gramEnd"/>
+      <w:r>
+        <w:t xml:space="preserve"> (Debounce check → Hallucination Prevention → Audit Trail)</w:t>
       </w:r>
     </w:p>
     <w:p>
@@ -1768,10 +1800,12 @@
         <w:t xml:space="preserve">: Mounts all dialogs directly to </w:t>
       </w:r>
       <w:proofErr w:type="spellStart"/>
+      <w:proofErr w:type="gramStart"/>
       <w:r>
         <w:t>document.body</w:t>
       </w:r>
       <w:proofErr w:type="spellEnd"/>
+      <w:proofErr w:type="gramEnd"/>
       <w:r>
         <w:t>, eliminating the CSS transform clipping bug where modals were pushed off-screen.</w:t>
       </w:r>
@@ -2829,8 +2863,13 @@
           <m:t>→</m:t>
         </m:r>
       </m:oMath>
-      <w:r>
-        <w:t xml:space="preserve">Signify listens, types the words, and </w:t>
+      <w:proofErr w:type="gramStart"/>
+      <w:r>
+        <w:t>Signify</w:t>
+      </w:r>
+      <w:proofErr w:type="gramEnd"/>
+      <w:r>
+        <w:t xml:space="preserve"> listens, types the words, and </w:t>
       </w:r>
       <w:r>
         <w:rPr>
@@ -3158,11 +3197,20 @@
           <w:b/>
           <w:bCs/>
         </w:rPr>
-        <w:t>Why Only This Tech Stack?</w:t>
+        <w:t xml:space="preserve">Why Only This Tech </w:t>
+      </w:r>
+      <w:proofErr w:type="gramStart"/>
+      <w:r>
+        <w:rPr>
+          <w:b/>
+          <w:bCs/>
+        </w:rPr>
+        <w:t>Stack?</w:t>
       </w:r>
       <w:r>
         <w:t>:</w:t>
       </w:r>
+      <w:proofErr w:type="gramEnd"/>
     </w:p>
     <w:p>
       <w:pPr>
@@ -3465,7 +3513,7 @@
     <w:p>
       <w:r>
         <w:pict w14:anchorId="6F108A5C">
-          <v:rect id="_x0000_i1058" style="width:468pt;height:.75pt" o:hralign="center" o:hrstd="t" o:hr="t" fillcolor="#a0a0a0" stroked="f"/>
+          <v:rect id="_x0000_i1040" style="width:468pt;height:.75pt" o:hralign="center" o:hrstd="t" o:hr="t" fillcolor="#a0a0a0" stroked="f"/>
         </w:pict>
       </w:r>
     </w:p>
@@ -3759,11 +3807,7 @@
             </w:r>
             <w:proofErr w:type="spellEnd"/>
             <w:r>
-              <w:t xml:space="preserve">), tool execution status </w:t>
-            </w:r>
-            <w:r>
-              <w:lastRenderedPageBreak/>
-              <w:t>(</w:t>
+              <w:t>), tool execution status (</w:t>
             </w:r>
             <w:proofErr w:type="spellStart"/>
             <w:r>
@@ -3796,7 +3840,6 @@
           </w:tcPr>
           <w:p>
             <w:r>
-              <w:lastRenderedPageBreak/>
               <w:t>backend/app/api/routes/orchestrator.py</w:t>
             </w:r>
           </w:p>
@@ -3821,6 +3864,7 @@
                 <w:b/>
                 <w:bCs/>
               </w:rPr>
+              <w:lastRenderedPageBreak/>
               <w:t>The Agent Interface</w:t>
             </w:r>
             <w:r>
@@ -3859,6 +3903,7 @@
           </w:tcPr>
           <w:p>
             <w:r>
+              <w:lastRenderedPageBreak/>
               <w:t>backend/app/core/database.py</w:t>
             </w:r>
           </w:p>
@@ -3911,7 +3956,7 @@
     <w:p>
       <w:r>
         <w:pict w14:anchorId="6898DB70">
-          <v:rect id="_x0000_i1059" style="width:468pt;height:.75pt" o:hralign="center" o:hrstd="t" o:hr="t" fillcolor="#a0a0a0" stroked="f"/>
+          <v:rect id="_x0000_i1041" style="width:468pt;height:.75pt" o:hralign="center" o:hrstd="t" o:hr="t" fillcolor="#a0a0a0" stroked="f"/>
         </w:pict>
       </w:r>
     </w:p>
@@ -3961,6 +4006,14 @@
         </w:rPr>
         <w:t>? (What to Tell Hackathon Judges)</w:t>
       </w:r>
+    </w:p>
+    <w:p>
+      <w:pPr>
+        <w:rPr>
+          <w:b/>
+          <w:bCs/>
+        </w:rPr>
+      </w:pPr>
     </w:p>
     <w:p>
       <w:r>
@@ -4009,6 +4062,7 @@
         <w:t>, here is the winning technical rationale:</w:t>
       </w:r>
     </w:p>
+    <w:p/>
     <w:p>
       <w:pPr>
         <w:numPr>
@@ -4048,7 +4102,15 @@
       </w:r>
       <w:proofErr w:type="spellEnd"/>
       <w:r>
-        <w:t xml:space="preserve"> are built for text chatbots where waiting 1 to 5 seconds for an LLM response is acceptable.</w:t>
+        <w:t xml:space="preserve"> are built for text chatbots </w:t>
+      </w:r>
+      <w:proofErr w:type="gramStart"/>
+      <w:r>
+        <w:t>where</w:t>
+      </w:r>
+      <w:proofErr w:type="gramEnd"/>
+      <w:r>
+        <w:t xml:space="preserve"> waiting 1 to 5 seconds for an LLM response is acceptable.</w:t>
       </w:r>
     </w:p>
     <w:p>
@@ -4182,19 +4244,21 @@
     </w:p>
     <w:p>
       <w:pPr>
+        <w:ind w:left="720"/>
+      </w:pPr>
+    </w:p>
+    <w:p>
+      <w:pPr>
+        <w:ind w:left="720"/>
+      </w:pPr>
+    </w:p>
+    <w:p>
+      <w:pPr>
         <w:numPr>
           <w:ilvl w:val="0"/>
           <w:numId w:val="17"/>
         </w:numPr>
       </w:pPr>
-    </w:p>
-    <w:p>
-      <w:pPr>
-        <w:numPr>
-          <w:ilvl w:val="0"/>
-          <w:numId w:val="17"/>
-        </w:numPr>
-      </w:pPr>
       <w:r>
         <w:rPr>
           <w:b/>
@@ -4258,7 +4322,7 @@
     <w:p>
       <w:r>
         <w:pict w14:anchorId="4B2746CE">
-          <v:rect id="_x0000_i1060" style="width:396pt;height:.75pt" o:hralign="center" o:hrstd="t" o:hr="t" fillcolor="#a0a0a0" stroked="f"/>
+          <v:rect id="_x0000_i1042" style="width:396pt;height:.75pt" o:hralign="center" o:hrstd="t" o:hr="t" fillcolor="#a0a0a0" stroked="f"/>
         </w:pict>
       </w:r>
     </w:p>
@@ -4462,6 +4526,1145 @@
       </w:r>
     </w:p>
     <w:p/>
+    <w:p/>
+    <w:p/>
+    <w:p/>
+    <w:p>
+      <w:pPr>
+        <w:rPr>
+          <w:b/>
+          <w:bCs/>
+        </w:rPr>
+      </w:pPr>
+      <w:r>
+        <w:rPr>
+          <w:rFonts w:ascii="Segoe UI Emoji" w:hAnsi="Segoe UI Emoji" w:cs="Segoe UI Emoji"/>
+          <w:b/>
+          <w:bCs/>
+        </w:rPr>
+        <w:t>🧠</w:t>
+      </w:r>
+      <w:r>
+        <w:rPr>
+          <w:b/>
+          <w:bCs/>
+        </w:rPr>
+        <w:t xml:space="preserve"> What is a DAG? (In Simple, Everyday Language)</w:t>
+      </w:r>
+    </w:p>
+    <w:p>
+      <w:r>
+        <w:rPr>
+          <w:b/>
+          <w:bCs/>
+        </w:rPr>
+        <w:t>DAG</w:t>
+      </w:r>
+      <w:r>
+        <w:t xml:space="preserve"> stands for:</w:t>
+      </w:r>
+    </w:p>
+    <w:p>
+      <w:pPr>
+        <w:numPr>
+          <w:ilvl w:val="0"/>
+          <w:numId w:val="18"/>
+        </w:numPr>
+      </w:pPr>
+      <w:r>
+        <w:rPr>
+          <w:b/>
+          <w:bCs/>
+        </w:rPr>
+        <w:t>D</w:t>
+      </w:r>
+      <w:r>
+        <w:t xml:space="preserve">irected: Every step has a clear, one-way direction (an arrow </w:t>
+      </w:r>
+      <m:oMath>
+        <m:r>
+          <w:rPr>
+            <w:rFonts w:ascii="Cambria Math" w:hAnsi="Cambria Math"/>
+          </w:rPr>
+          <m:t>→</m:t>
+        </m:r>
+      </m:oMath>
+      <w:r>
+        <w:t>pointing forward).</w:t>
+      </w:r>
+    </w:p>
+    <w:p>
+      <w:pPr>
+        <w:numPr>
+          <w:ilvl w:val="0"/>
+          <w:numId w:val="18"/>
+        </w:numPr>
+      </w:pPr>
+      <w:r>
+        <w:rPr>
+          <w:b/>
+          <w:bCs/>
+        </w:rPr>
+        <w:t>A</w:t>
+      </w:r>
+      <w:r>
+        <w:t xml:space="preserve">cyclic: There are </w:t>
+      </w:r>
+      <w:r>
+        <w:rPr>
+          <w:b/>
+          <w:bCs/>
+        </w:rPr>
+        <w:t>no endless loops or circles</w:t>
+      </w:r>
+      <w:r>
+        <w:t xml:space="preserve"> (you never get trapped in </w:t>
+      </w:r>
+      <m:oMath>
+        <m:r>
+          <w:rPr>
+            <w:rFonts w:ascii="Cambria Math" w:hAnsi="Cambria Math"/>
+          </w:rPr>
+          <m:t>A→B→C→A</m:t>
+        </m:r>
+      </m:oMath>
+      <w:r>
+        <w:t>).</w:t>
+      </w:r>
+    </w:p>
+    <w:p>
+      <w:pPr>
+        <w:numPr>
+          <w:ilvl w:val="0"/>
+          <w:numId w:val="18"/>
+        </w:numPr>
+      </w:pPr>
+      <w:r>
+        <w:rPr>
+          <w:b/>
+          <w:bCs/>
+        </w:rPr>
+        <w:t>G</w:t>
+      </w:r>
+      <w:r>
+        <w:t>raph: A map of steps or tasks connected by dependency lines.</w:t>
+      </w:r>
+    </w:p>
+    <w:p>
+      <w:r>
+        <w:pict w14:anchorId="77B6DA4A">
+          <v:rect id="_x0000_i1061" style="width:6in;height:.75pt" o:hralign="center" o:hrstd="t" o:hr="t" fillcolor="#a0a0a0" stroked="f"/>
+        </w:pict>
+      </w:r>
+    </w:p>
+    <w:p>
+      <w:pPr>
+        <w:rPr>
+          <w:b/>
+          <w:bCs/>
+        </w:rPr>
+      </w:pPr>
+      <w:r>
+        <w:rPr>
+          <w:rFonts w:ascii="Segoe UI Emoji" w:hAnsi="Segoe UI Emoji" w:cs="Segoe UI Emoji"/>
+          <w:b/>
+          <w:bCs/>
+        </w:rPr>
+        <w:t>☕</w:t>
+      </w:r>
+      <w:r>
+        <w:rPr>
+          <w:b/>
+          <w:bCs/>
+        </w:rPr>
+        <w:t xml:space="preserve"> A Real-World Example: Making Chai (Tea)</w:t>
+      </w:r>
+    </w:p>
+    <w:p>
+      <w:r>
+        <w:t>Think of making morning tea:</w:t>
+      </w:r>
+    </w:p>
+    <w:p>
+      <w:r>
+        <w:t>text</w:t>
+      </w:r>
+    </w:p>
+    <w:p>
+      <w:r>
+        <w:t>[Step 1: Boil Water &amp; Milk]</w:t>
+      </w:r>
+    </w:p>
+    <w:p>
+      <w:r>
+        <w:t xml:space="preserve">           │</w:t>
+      </w:r>
+    </w:p>
+    <w:p>
+      <w:r>
+        <w:t xml:space="preserve">     ┌─────</w:t>
+      </w:r>
+      <w:r>
+        <w:rPr>
+          <w:rFonts w:ascii="MS Gothic" w:eastAsia="MS Gothic" w:hAnsi="MS Gothic" w:cs="MS Gothic" w:hint="eastAsia"/>
+        </w:rPr>
+        <w:t>┴</w:t>
+      </w:r>
+      <w:r>
+        <w:rPr>
+          <w:rFonts w:ascii="Aptos" w:hAnsi="Aptos" w:cs="Aptos"/>
+        </w:rPr>
+        <w:t>──────────────┐</w:t>
+      </w:r>
+    </w:p>
+    <w:p>
+      <w:r>
+        <w:t xml:space="preserve">    </w:t>
+      </w:r>
+      <w:r>
+        <w:rPr>
+          <w:rFonts w:ascii="Arial" w:hAnsi="Arial" w:cs="Arial"/>
+        </w:rPr>
+        <w:t>▼</w:t>
+      </w:r>
+      <w:r>
+        <w:t xml:space="preserve">                   </w:t>
+      </w:r>
+      <w:r>
+        <w:t xml:space="preserve">                             </w:t>
+      </w:r>
+      <w:r>
+        <w:t xml:space="preserve"> </w:t>
+      </w:r>
+      <w:r>
+        <w:rPr>
+          <w:rFonts w:ascii="Arial" w:hAnsi="Arial" w:cs="Arial"/>
+        </w:rPr>
+        <w:t>▼</w:t>
+      </w:r>
+    </w:p>
+    <w:p>
+      <w:r>
+        <w:t xml:space="preserve">[Step 2: Add </w:t>
+      </w:r>
+      <w:proofErr w:type="gramStart"/>
+      <w:r>
+        <w:t xml:space="preserve">Ginger]   </w:t>
+      </w:r>
+      <w:proofErr w:type="gramEnd"/>
+      <w:r>
+        <w:t xml:space="preserve">  </w:t>
+      </w:r>
+      <w:proofErr w:type="gramStart"/>
+      <w:r>
+        <w:t xml:space="preserve">   </w:t>
+      </w:r>
+      <w:r>
+        <w:t>[</w:t>
+      </w:r>
+      <w:proofErr w:type="gramEnd"/>
+      <w:r>
+        <w:t xml:space="preserve">Step 3: Add </w:t>
+      </w:r>
+      <w:proofErr w:type="gramStart"/>
+      <w:r>
+        <w:t>Sugar]  &lt;</w:t>
+      </w:r>
+      <w:proofErr w:type="gramEnd"/>
+      <w:r>
+        <w:t>-- (Can happen in parallel!)</w:t>
+      </w:r>
+    </w:p>
+    <w:p>
+      <w:r>
+        <w:t xml:space="preserve">     └─────</w:t>
+      </w:r>
+      <w:r>
+        <w:rPr>
+          <w:rFonts w:ascii="MS Gothic" w:eastAsia="MS Gothic" w:hAnsi="MS Gothic" w:cs="MS Gothic" w:hint="eastAsia"/>
+        </w:rPr>
+        <w:t>┬</w:t>
+      </w:r>
+      <w:r>
+        <w:rPr>
+          <w:rFonts w:ascii="Aptos" w:hAnsi="Aptos" w:cs="Aptos"/>
+        </w:rPr>
+        <w:t>──────────────┘</w:t>
+      </w:r>
+    </w:p>
+    <w:p>
+      <w:r>
+        <w:t xml:space="preserve">           </w:t>
+      </w:r>
+      <w:r>
+        <w:t xml:space="preserve">         </w:t>
+      </w:r>
+      <w:r>
+        <w:rPr>
+          <w:rFonts w:ascii="Arial" w:hAnsi="Arial" w:cs="Arial"/>
+        </w:rPr>
+        <w:t>▼</w:t>
+      </w:r>
+    </w:p>
+    <w:p>
+      <w:r>
+        <w:t xml:space="preserve">[Step 4: Strain into </w:t>
+      </w:r>
+      <w:proofErr w:type="gramStart"/>
+      <w:r>
+        <w:t>Cup]  &lt;</w:t>
+      </w:r>
+      <w:proofErr w:type="gramEnd"/>
+      <w:r>
+        <w:t>-- (Depends on Step 2 &amp; 3 being done!)</w:t>
+      </w:r>
+    </w:p>
+    <w:p>
+      <w:r>
+        <w:t xml:space="preserve">           │</w:t>
+      </w:r>
+    </w:p>
+    <w:p>
+      <w:r>
+        <w:t xml:space="preserve">           </w:t>
+      </w:r>
+      <w:r>
+        <w:rPr>
+          <w:rFonts w:ascii="Arial" w:hAnsi="Arial" w:cs="Arial"/>
+        </w:rPr>
+        <w:t>▼</w:t>
+      </w:r>
+    </w:p>
+    <w:p>
+      <w:r>
+        <w:t>[Step 5: Drink Chai]</w:t>
+      </w:r>
+    </w:p>
+    <w:p/>
+    <w:p>
+      <w:pPr>
+        <w:numPr>
+          <w:ilvl w:val="0"/>
+          <w:numId w:val="19"/>
+        </w:numPr>
+      </w:pPr>
+      <w:r>
+        <w:rPr>
+          <w:b/>
+          <w:bCs/>
+        </w:rPr>
+        <w:t>Why is this a DAG?</w:t>
+      </w:r>
+      <w:r>
+        <w:t xml:space="preserve"> </w:t>
+      </w:r>
+    </w:p>
+    <w:p>
+      <w:pPr>
+        <w:numPr>
+          <w:ilvl w:val="1"/>
+          <w:numId w:val="19"/>
+        </w:numPr>
+      </w:pPr>
+      <w:r>
+        <w:rPr>
+          <w:b/>
+          <w:bCs/>
+        </w:rPr>
+        <w:t>Directed:</w:t>
+      </w:r>
+      <w:r>
+        <w:t xml:space="preserve"> You cannot drink the tea </w:t>
+      </w:r>
+      <w:r>
+        <w:rPr>
+          <w:i/>
+          <w:iCs/>
+        </w:rPr>
+        <w:t>before</w:t>
+      </w:r>
+      <w:r>
+        <w:t xml:space="preserve"> boiling it.</w:t>
+      </w:r>
+    </w:p>
+    <w:p>
+      <w:pPr>
+        <w:numPr>
+          <w:ilvl w:val="1"/>
+          <w:numId w:val="19"/>
+        </w:numPr>
+      </w:pPr>
+      <w:r>
+        <w:rPr>
+          <w:b/>
+          <w:bCs/>
+        </w:rPr>
+        <w:t>Acyclic (No Loop):</w:t>
+      </w:r>
+      <w:r>
+        <w:t xml:space="preserve"> Once you finish Step 5, you don't magically loop back to raw milk. It terminates cleanly.</w:t>
+      </w:r>
+    </w:p>
+    <w:p>
+      <w:pPr>
+        <w:numPr>
+          <w:ilvl w:val="1"/>
+          <w:numId w:val="19"/>
+        </w:numPr>
+      </w:pPr>
+      <w:r>
+        <w:rPr>
+          <w:b/>
+          <w:bCs/>
+        </w:rPr>
+        <w:lastRenderedPageBreak/>
+        <w:t>Dependencies:</w:t>
+      </w:r>
+      <w:r>
+        <w:t xml:space="preserve"> Step 4 knows it must wait until </w:t>
+      </w:r>
+      <w:r>
+        <w:rPr>
+          <w:i/>
+          <w:iCs/>
+        </w:rPr>
+        <w:t>both</w:t>
+      </w:r>
+      <w:r>
+        <w:t xml:space="preserve"> Step 2 and Step 3 are finished.</w:t>
+      </w:r>
+    </w:p>
+    <w:p>
+      <w:r>
+        <w:pict w14:anchorId="3CE148F0">
+          <v:rect id="_x0000_i1062" style="width:396pt;height:.75pt" o:hralign="center" o:hrstd="t" o:hr="t" fillcolor="#a0a0a0" stroked="f"/>
+        </w:pict>
+      </w:r>
+    </w:p>
+    <w:p>
+      <w:pPr>
+        <w:rPr>
+          <w:b/>
+          <w:bCs/>
+        </w:rPr>
+      </w:pPr>
+      <w:r>
+        <w:rPr>
+          <w:rFonts w:ascii="Segoe UI Emoji" w:hAnsi="Segoe UI Emoji" w:cs="Segoe UI Emoji"/>
+          <w:b/>
+          <w:bCs/>
+        </w:rPr>
+        <w:t>🎯</w:t>
+      </w:r>
+      <w:r>
+        <w:rPr>
+          <w:b/>
+          <w:bCs/>
+        </w:rPr>
+        <w:t xml:space="preserve"> Why Did We Use a DAG in Signify?</w:t>
+      </w:r>
+    </w:p>
+    <w:p>
+      <w:r>
+        <w:t>In Signify, turning a Deaf person's sign gesture into bilingual speech requires multiple distinct AI tools working in harmony:</w:t>
+      </w:r>
+    </w:p>
+    <w:p>
+      <w:r>
+        <w:t>[Step 1: Calibrate Camera &amp; Check Consent]</w:t>
+      </w:r>
+    </w:p>
+    <w:p>
+      <w:r>
+        <w:t xml:space="preserve">                    │</w:t>
+      </w:r>
+    </w:p>
+    <w:p>
+      <w:r>
+        <w:t xml:space="preserve">                    </w:t>
+      </w:r>
+      <w:r>
+        <w:rPr>
+          <w:rFonts w:ascii="Arial" w:hAnsi="Arial" w:cs="Arial"/>
+        </w:rPr>
+        <w:t>▼</w:t>
+      </w:r>
+    </w:p>
+    <w:p>
+      <w:r>
+        <w:t>[Step 2: Extract &amp; Classify Hand Landmarks]</w:t>
+      </w:r>
+    </w:p>
+    <w:p>
+      <w:r>
+        <w:t xml:space="preserve">                    │</w:t>
+      </w:r>
+    </w:p>
+    <w:p>
+      <w:r>
+        <w:t xml:space="preserve">       ┌────────────</w:t>
+      </w:r>
+      <w:r>
+        <w:rPr>
+          <w:rFonts w:ascii="MS Gothic" w:eastAsia="MS Gothic" w:hAnsi="MS Gothic" w:cs="MS Gothic" w:hint="eastAsia"/>
+        </w:rPr>
+        <w:t>┴</w:t>
+      </w:r>
+      <w:r>
+        <w:rPr>
+          <w:rFonts w:ascii="Aptos" w:hAnsi="Aptos" w:cs="Aptos"/>
+        </w:rPr>
+        <w:t>────────────┐</w:t>
+      </w:r>
+    </w:p>
+    <w:p>
+      <w:r>
+        <w:t xml:space="preserve">       </w:t>
+      </w:r>
+      <w:r>
+        <w:rPr>
+          <w:rFonts w:ascii="Arial" w:hAnsi="Arial" w:cs="Arial"/>
+        </w:rPr>
+        <w:t>▼</w:t>
+      </w:r>
+      <w:r>
+        <w:t xml:space="preserve">                         </w:t>
+      </w:r>
+      <w:r>
+        <w:t xml:space="preserve">                                    </w:t>
+      </w:r>
+      <w:r>
+        <w:rPr>
+          <w:rFonts w:ascii="Arial" w:hAnsi="Arial" w:cs="Arial"/>
+        </w:rPr>
+        <w:t>▼</w:t>
+      </w:r>
+    </w:p>
+    <w:p>
+      <w:r>
+        <w:t xml:space="preserve">[Step 3: English </w:t>
+      </w:r>
+      <w:proofErr w:type="gramStart"/>
+      <w:r>
+        <w:t xml:space="preserve">TTS]  </w:t>
+      </w:r>
+      <w:r>
+        <w:t xml:space="preserve"> </w:t>
+      </w:r>
+      <w:proofErr w:type="gramEnd"/>
+      <w:r>
+        <w:t xml:space="preserve">     </w:t>
+      </w:r>
+      <w:proofErr w:type="gramStart"/>
+      <w:r>
+        <w:t xml:space="preserve"> </w:t>
+      </w:r>
+      <w:r>
+        <w:t xml:space="preserve">  [</w:t>
+      </w:r>
+      <w:proofErr w:type="gramEnd"/>
+      <w:r>
+        <w:t>Step 4: Hindi Translation]</w:t>
+      </w:r>
+    </w:p>
+    <w:p>
+      <w:r>
+        <w:t xml:space="preserve">                                 │</w:t>
+      </w:r>
+    </w:p>
+    <w:p>
+      <w:r>
+        <w:t xml:space="preserve">                                 </w:t>
+      </w:r>
+      <w:r>
+        <w:rPr>
+          <w:rFonts w:ascii="Arial" w:hAnsi="Arial" w:cs="Arial"/>
+        </w:rPr>
+        <w:t>▼</w:t>
+      </w:r>
+    </w:p>
+    <w:p>
+      <w:r>
+        <w:t xml:space="preserve">                         [Step 5: Hindi TTS]</w:t>
+      </w:r>
+    </w:p>
+    <w:p>
+      <w:r>
+        <w:t>Here is why a DAG is essential for our app:</w:t>
+      </w:r>
+    </w:p>
+    <w:p>
+      <w:pPr>
+        <w:numPr>
+          <w:ilvl w:val="0"/>
+          <w:numId w:val="20"/>
+        </w:numPr>
+      </w:pPr>
+      <w:r>
+        <w:rPr>
+          <w:b/>
+          <w:bCs/>
+        </w:rPr>
+        <w:t>Step-by-Step Dependencies:</w:t>
+      </w:r>
+    </w:p>
+    <w:p>
+      <w:pPr>
+        <w:numPr>
+          <w:ilvl w:val="1"/>
+          <w:numId w:val="20"/>
+        </w:numPr>
+      </w:pPr>
+      <w:r>
+        <w:t xml:space="preserve">Step 5 (Hindi voice) </w:t>
+      </w:r>
+      <w:r>
+        <w:rPr>
+          <w:b/>
+          <w:bCs/>
+        </w:rPr>
+        <w:t>cannot run</w:t>
+      </w:r>
+      <w:r>
+        <w:t xml:space="preserve"> until Step 4 produces the Hindi translation.</w:t>
+      </w:r>
+    </w:p>
+    <w:p>
+      <w:pPr>
+        <w:numPr>
+          <w:ilvl w:val="1"/>
+          <w:numId w:val="20"/>
+        </w:numPr>
+      </w:pPr>
+      <w:r>
+        <w:t xml:space="preserve">Step 4 </w:t>
+      </w:r>
+      <w:r>
+        <w:rPr>
+          <w:b/>
+          <w:bCs/>
+        </w:rPr>
+        <w:t>cannot run</w:t>
+      </w:r>
+      <w:r>
+        <w:t xml:space="preserve"> until Step 2 tells us which sign was recognized.</w:t>
+      </w:r>
+    </w:p>
+    <w:p>
+      <w:pPr>
+        <w:numPr>
+          <w:ilvl w:val="1"/>
+          <w:numId w:val="20"/>
+        </w:numPr>
+      </w:pPr>
+      <w:r>
+        <w:t>The DAG ensures tools execute in the exact right order.</w:t>
+      </w:r>
+    </w:p>
+    <w:p>
+      <w:pPr>
+        <w:numPr>
+          <w:ilvl w:val="0"/>
+          <w:numId w:val="20"/>
+        </w:numPr>
+      </w:pPr>
+      <w:r>
+        <w:rPr>
+          <w:b/>
+          <w:bCs/>
+        </w:rPr>
+        <w:t>Parallel Speed (Under 120ms):</w:t>
+      </w:r>
+    </w:p>
+    <w:p>
+      <w:pPr>
+        <w:numPr>
+          <w:ilvl w:val="1"/>
+          <w:numId w:val="20"/>
+        </w:numPr>
+      </w:pPr>
+      <w:r>
+        <w:t>While the VerbX API is translating English to Hindi in Step 4, Step 3 can prepare the English audio in parallel. This saves valuable milliseconds.</w:t>
+      </w:r>
+    </w:p>
+    <w:p>
+      <w:pPr>
+        <w:numPr>
+          <w:ilvl w:val="0"/>
+          <w:numId w:val="20"/>
+        </w:numPr>
+      </w:pPr>
+      <w:r>
+        <w:rPr>
+          <w:b/>
+          <w:bCs/>
+        </w:rPr>
+        <w:t>Autonomous Dynamic Replanning (Safety / Anti-Hallucination):</w:t>
+      </w:r>
+    </w:p>
+    <w:p>
+      <w:pPr>
+        <w:numPr>
+          <w:ilvl w:val="1"/>
+          <w:numId w:val="20"/>
+        </w:numPr>
+      </w:pPr>
+      <w:r>
+        <w:t>What if the user just scratches their face or makes an unknown movement?</w:t>
+      </w:r>
+    </w:p>
+    <w:p>
+      <w:pPr>
+        <w:numPr>
+          <w:ilvl w:val="1"/>
+          <w:numId w:val="20"/>
+        </w:numPr>
+      </w:pPr>
+      <w:r>
+        <w:lastRenderedPageBreak/>
+        <w:t xml:space="preserve">In Step 2, the vision confidence drops below </w:t>
+      </w:r>
+      <m:oMath>
+        <m:r>
+          <w:rPr>
+            <w:rFonts w:ascii="Cambria Math" w:hAnsi="Cambria Math"/>
+          </w:rPr>
+          <m:t>0.65</m:t>
+        </m:r>
+      </m:oMath>
+      <w:r>
+        <w:t>.</w:t>
+      </w:r>
+    </w:p>
+    <w:p>
+      <w:pPr>
+        <w:numPr>
+          <w:ilvl w:val="1"/>
+          <w:numId w:val="20"/>
+        </w:numPr>
+      </w:pPr>
+      <w:r>
+        <w:t xml:space="preserve">Because it's a DAG, </w:t>
+      </w:r>
+      <w:r>
+        <w:rPr>
+          <w:b/>
+          <w:bCs/>
+        </w:rPr>
+        <w:t>the Thinking Brain (Planner) dynamically modifies the graph</w:t>
+      </w:r>
+      <w:r>
+        <w:t xml:space="preserve">: </w:t>
+      </w:r>
+    </w:p>
+    <w:p>
+      <w:pPr>
+        <w:numPr>
+          <w:ilvl w:val="2"/>
+          <w:numId w:val="20"/>
+        </w:numPr>
+      </w:pPr>
+      <w:r>
+        <w:t xml:space="preserve">It </w:t>
+      </w:r>
+      <w:r>
+        <w:rPr>
+          <w:b/>
+          <w:bCs/>
+        </w:rPr>
+        <w:t>prunes/skips Steps 3, 4, and 5</w:t>
+      </w:r>
+      <w:r>
+        <w:t xml:space="preserve"> (stopping false speech from ever playing).</w:t>
+      </w:r>
+    </w:p>
+    <w:p>
+      <w:pPr>
+        <w:numPr>
+          <w:ilvl w:val="2"/>
+          <w:numId w:val="20"/>
+        </w:numPr>
+      </w:pPr>
+      <w:r>
+        <w:t xml:space="preserve">It </w:t>
+      </w:r>
+      <w:r>
+        <w:rPr>
+          <w:b/>
+          <w:bCs/>
+        </w:rPr>
+        <w:t>inserts an UNCERTAIN disclosure step</w:t>
+      </w:r>
+      <w:r>
+        <w:t xml:space="preserve"> on the screen.</w:t>
+      </w:r>
+    </w:p>
+    <w:p>
+      <w:r>
+        <w:pict w14:anchorId="29B7E300">
+          <v:rect id="_x0000_i1063" style="width:5in;height:.75pt" o:hralign="center" o:hrstd="t" o:hr="t" fillcolor="#a0a0a0" stroked="f"/>
+        </w:pict>
+      </w:r>
+    </w:p>
+    <w:p>
+      <w:pPr>
+        <w:rPr>
+          <w:b/>
+          <w:bCs/>
+        </w:rPr>
+      </w:pPr>
+      <w:r>
+        <w:rPr>
+          <w:rFonts w:ascii="Segoe UI Emoji" w:hAnsi="Segoe UI Emoji" w:cs="Segoe UI Emoji"/>
+          <w:b/>
+          <w:bCs/>
+        </w:rPr>
+        <w:t>🤖</w:t>
+      </w:r>
+      <w:r>
+        <w:rPr>
+          <w:b/>
+          <w:bCs/>
+        </w:rPr>
+        <w:t xml:space="preserve"> Do Agentic AI Apps Really Need a DAG?</w:t>
+      </w:r>
+    </w:p>
+    <w:p>
+      <w:pPr>
+        <w:rPr>
+          <w:b/>
+          <w:bCs/>
+        </w:rPr>
+      </w:pPr>
+    </w:p>
+    <w:p>
+      <w:r>
+        <w:rPr>
+          <w:b/>
+          <w:bCs/>
+        </w:rPr>
+        <w:t>YES, absolutely! Here is why:</w:t>
+      </w:r>
+    </w:p>
+    <w:tbl>
+      <w:tblPr>
+        <w:tblW w:w="0" w:type="auto"/>
+        <w:tblCellSpacing w:w="15" w:type="dxa"/>
+        <w:tblCellMar>
+          <w:top w:w="15" w:type="dxa"/>
+          <w:left w:w="15" w:type="dxa"/>
+          <w:bottom w:w="15" w:type="dxa"/>
+          <w:right w:w="15" w:type="dxa"/>
+        </w:tblCellMar>
+        <w:tblLook w:val="04A0" w:firstRow="1" w:lastRow="0" w:firstColumn="1" w:lastColumn="0" w:noHBand="0" w:noVBand="1"/>
+      </w:tblPr>
+      <w:tblGrid>
+        <w:gridCol w:w="4361"/>
+        <w:gridCol w:w="4665"/>
+      </w:tblGrid>
+      <w:tr>
+        <w:trPr>
+          <w:tblHeader/>
+          <w:tblCellSpacing w:w="15" w:type="dxa"/>
+        </w:trPr>
+        <w:tc>
+          <w:tcPr>
+            <w:tcW w:w="0" w:type="auto"/>
+            <w:vAlign w:val="center"/>
+            <w:hideMark/>
+          </w:tcPr>
+          <w:p>
+            <w:pPr>
+              <w:rPr>
+                <w:b/>
+                <w:bCs/>
+              </w:rPr>
+            </w:pPr>
+            <w:r>
+              <w:rPr>
+                <w:b/>
+                <w:bCs/>
+              </w:rPr>
+              <w:t>Without a DAG (Naive Agent)</w:t>
+            </w:r>
+          </w:p>
+        </w:tc>
+        <w:tc>
+          <w:tcPr>
+            <w:tcW w:w="0" w:type="auto"/>
+            <w:vAlign w:val="center"/>
+            <w:hideMark/>
+          </w:tcPr>
+          <w:p>
+            <w:pPr>
+              <w:rPr>
+                <w:b/>
+                <w:bCs/>
+              </w:rPr>
+            </w:pPr>
+            <w:r>
+              <w:rPr>
+                <w:b/>
+                <w:bCs/>
+              </w:rPr>
+              <w:t>With a DAG (</w:t>
+            </w:r>
+            <w:proofErr w:type="spellStart"/>
+            <w:r>
+              <w:rPr>
+                <w:b/>
+                <w:bCs/>
+              </w:rPr>
+              <w:t>Signify's</w:t>
+            </w:r>
+            <w:proofErr w:type="spellEnd"/>
+            <w:r>
+              <w:rPr>
+                <w:b/>
+                <w:bCs/>
+              </w:rPr>
+              <w:t xml:space="preserve"> Thinking Brain)</w:t>
+            </w:r>
+          </w:p>
+        </w:tc>
+      </w:tr>
+      <w:tr>
+        <w:trPr>
+          <w:tblCellSpacing w:w="15" w:type="dxa"/>
+        </w:trPr>
+        <w:tc>
+          <w:tcPr>
+            <w:tcW w:w="0" w:type="auto"/>
+            <w:vAlign w:val="center"/>
+            <w:hideMark/>
+          </w:tcPr>
+          <w:p>
+            <w:r>
+              <w:rPr>
+                <w:b/>
+                <w:bCs/>
+              </w:rPr>
+              <w:t>Chaos &amp; Hallucinations:</w:t>
+            </w:r>
+            <w:r>
+              <w:t xml:space="preserve"> The agent guesses which tool to call next on the fly.</w:t>
+            </w:r>
+          </w:p>
+        </w:tc>
+        <w:tc>
+          <w:tcPr>
+            <w:tcW w:w="0" w:type="auto"/>
+            <w:vAlign w:val="center"/>
+            <w:hideMark/>
+          </w:tcPr>
+          <w:p>
+            <w:r>
+              <w:rPr>
+                <w:b/>
+                <w:bCs/>
+              </w:rPr>
+              <w:t>Structured Plan:</w:t>
+            </w:r>
+            <w:r>
+              <w:t xml:space="preserve"> The agent builds a clean, directed execution path before running.</w:t>
+            </w:r>
+          </w:p>
+        </w:tc>
+      </w:tr>
+      <w:tr>
+        <w:trPr>
+          <w:tblCellSpacing w:w="15" w:type="dxa"/>
+        </w:trPr>
+        <w:tc>
+          <w:tcPr>
+            <w:tcW w:w="0" w:type="auto"/>
+            <w:vAlign w:val="center"/>
+            <w:hideMark/>
+          </w:tcPr>
+          <w:p>
+            <w:r>
+              <w:rPr>
+                <w:b/>
+                <w:bCs/>
+              </w:rPr>
+              <w:t>Endless Loops:</w:t>
+            </w:r>
+            <w:r>
+              <w:t xml:space="preserve"> An LLM can get stuck calling the same tool over and over, burning all your API credits.</w:t>
+            </w:r>
+          </w:p>
+        </w:tc>
+        <w:tc>
+          <w:tcPr>
+            <w:tcW w:w="0" w:type="auto"/>
+            <w:vAlign w:val="center"/>
+            <w:hideMark/>
+          </w:tcPr>
+          <w:p>
+            <w:r>
+              <w:rPr>
+                <w:b/>
+                <w:bCs/>
+              </w:rPr>
+              <w:t>Guaranteed Termination:</w:t>
+            </w:r>
+            <w:r>
+              <w:t xml:space="preserve"> Being </w:t>
+            </w:r>
+            <w:r>
+              <w:rPr>
+                <w:b/>
+                <w:bCs/>
+              </w:rPr>
+              <w:t>Acyclic</w:t>
+            </w:r>
+            <w:r>
+              <w:t xml:space="preserve"> means it is mathematically impossible to get trapped in an infinite loop.</w:t>
+            </w:r>
+          </w:p>
+        </w:tc>
+      </w:tr>
+      <w:tr>
+        <w:trPr>
+          <w:tblCellSpacing w:w="15" w:type="dxa"/>
+        </w:trPr>
+        <w:tc>
+          <w:tcPr>
+            <w:tcW w:w="0" w:type="auto"/>
+            <w:vAlign w:val="center"/>
+            <w:hideMark/>
+          </w:tcPr>
+          <w:p>
+            <w:r>
+              <w:rPr>
+                <w:b/>
+                <w:bCs/>
+              </w:rPr>
+              <w:t>No Safety Pruning:</w:t>
+            </w:r>
+            <w:r>
+              <w:t xml:space="preserve"> If a step fails, the app crashes or outputs nonsense.</w:t>
+            </w:r>
+          </w:p>
+        </w:tc>
+        <w:tc>
+          <w:tcPr>
+            <w:tcW w:w="0" w:type="auto"/>
+            <w:vAlign w:val="center"/>
+            <w:hideMark/>
+          </w:tcPr>
+          <w:p>
+            <w:r>
+              <w:rPr>
+                <w:b/>
+                <w:bCs/>
+              </w:rPr>
+              <w:t>Smart Adaptation:</w:t>
+            </w:r>
+            <w:r>
+              <w:t xml:space="preserve"> If step 2 fails, the planner prunes child steps safely.</w:t>
+            </w:r>
+          </w:p>
+        </w:tc>
+      </w:tr>
+      <w:tr>
+        <w:trPr>
+          <w:tblCellSpacing w:w="15" w:type="dxa"/>
+        </w:trPr>
+        <w:tc>
+          <w:tcPr>
+            <w:tcW w:w="0" w:type="auto"/>
+            <w:vAlign w:val="center"/>
+            <w:hideMark/>
+          </w:tcPr>
+          <w:p>
+            <w:r>
+              <w:rPr>
+                <w:b/>
+                <w:bCs/>
+              </w:rPr>
+              <w:t>Black Box:</w:t>
+            </w:r>
+            <w:r>
+              <w:t xml:space="preserve"> You have no idea why an error happened.</w:t>
+            </w:r>
+          </w:p>
+        </w:tc>
+        <w:tc>
+          <w:tcPr>
+            <w:tcW w:w="0" w:type="auto"/>
+            <w:vAlign w:val="center"/>
+            <w:hideMark/>
+          </w:tcPr>
+          <w:p>
+            <w:r>
+              <w:rPr>
+                <w:b/>
+                <w:bCs/>
+              </w:rPr>
+              <w:t>100% Auditable:</w:t>
+            </w:r>
+            <w:r>
+              <w:t xml:space="preserve"> Every step in the DAG logs its latency, inputs, and outputs to the database.</w:t>
+            </w:r>
+          </w:p>
+        </w:tc>
+      </w:tr>
+    </w:tbl>
+    <w:p>
+      <w:pPr>
+        <w:rPr>
+          <w:b/>
+          <w:bCs/>
+        </w:rPr>
+      </w:pPr>
+    </w:p>
+    <w:p>
+      <w:pPr>
+        <w:rPr>
+          <w:b/>
+          <w:bCs/>
+        </w:rPr>
+      </w:pPr>
+    </w:p>
+    <w:p>
+      <w:pPr>
+        <w:rPr>
+          <w:b/>
+          <w:bCs/>
+        </w:rPr>
+      </w:pPr>
+      <w:r>
+        <w:rPr>
+          <w:b/>
+          <w:bCs/>
+        </w:rPr>
+        <w:t>Summary</w:t>
+      </w:r>
+    </w:p>
+    <w:p>
+      <w:r>
+        <w:t xml:space="preserve">In Signify, the </w:t>
+      </w:r>
+      <w:r>
+        <w:rPr>
+          <w:b/>
+          <w:bCs/>
+        </w:rPr>
+        <w:t>DAG is the blueprint</w:t>
+      </w:r>
+      <w:r>
+        <w:t xml:space="preserve"> created by the Autonomous Goal Planner (</w:t>
+      </w:r>
+      <w:proofErr w:type="spellStart"/>
+      <w:r>
+        <w:t>AutonomousGoalPlanner</w:t>
+      </w:r>
+      <w:proofErr w:type="spellEnd"/>
+      <w:r>
+        <w:t>). It guarantees that our vision model, translation engine, and speech synthesizers run in the exact logical order—safely, fast, and without ever getting stuck in an infinite loop.</w:t>
+      </w:r>
+    </w:p>
     <w:p/>
     <w:sectPr>
       <w:pgSz w:w="11906" w:h="16838"/>
@@ -4625,6 +5828,155 @@
     </w:lvl>
   </w:abstractNum>
   <w:abstractNum w:abstractNumId="1" w15:restartNumberingAfterBreak="0">
+    <w:nsid w:val="05361FE3"/>
+    <w:multiLevelType w:val="multilevel"/>
+    <w:tmpl w:val="E4FE9190"/>
+    <w:lvl w:ilvl="0">
+      <w:start w:val="1"/>
+      <w:numFmt w:val="bullet"/>
+      <w:lvlText w:val=""/>
+      <w:lvlJc w:val="left"/>
+      <w:pPr>
+        <w:tabs>
+          <w:tab w:val="num" w:pos="720"/>
+        </w:tabs>
+        <w:ind w:left="720" w:hanging="360"/>
+      </w:pPr>
+      <w:rPr>
+        <w:rFonts w:ascii="Symbol" w:hAnsi="Symbol" w:hint="default"/>
+        <w:sz w:val="20"/>
+      </w:rPr>
+    </w:lvl>
+    <w:lvl w:ilvl="1" w:tentative="1">
+      <w:start w:val="1"/>
+      <w:numFmt w:val="bullet"/>
+      <w:lvlText w:val="o"/>
+      <w:lvlJc w:val="left"/>
+      <w:pPr>
+        <w:tabs>
+          <w:tab w:val="num" w:pos="1440"/>
+        </w:tabs>
+        <w:ind w:left="1440" w:hanging="360"/>
+      </w:pPr>
+      <w:rPr>
+        <w:rFonts w:ascii="Courier New" w:hAnsi="Courier New" w:hint="default"/>
+        <w:sz w:val="20"/>
+      </w:rPr>
+    </w:lvl>
+    <w:lvl w:ilvl="2" w:tentative="1">
+      <w:start w:val="1"/>
+      <w:numFmt w:val="bullet"/>
+      <w:lvlText w:val=""/>
+      <w:lvlJc w:val="left"/>
+      <w:pPr>
+        <w:tabs>
+          <w:tab w:val="num" w:pos="2160"/>
+        </w:tabs>
+        <w:ind w:left="2160" w:hanging="360"/>
+      </w:pPr>
+      <w:rPr>
+        <w:rFonts w:ascii="Wingdings" w:hAnsi="Wingdings" w:hint="default"/>
+        <w:sz w:val="20"/>
+      </w:rPr>
+    </w:lvl>
+    <w:lvl w:ilvl="3" w:tentative="1">
+      <w:start w:val="1"/>
+      <w:numFmt w:val="bullet"/>
+      <w:lvlText w:val=""/>
+      <w:lvlJc w:val="left"/>
+      <w:pPr>
+        <w:tabs>
+          <w:tab w:val="num" w:pos="2880"/>
+        </w:tabs>
+        <w:ind w:left="2880" w:hanging="360"/>
+      </w:pPr>
+      <w:rPr>
+        <w:rFonts w:ascii="Wingdings" w:hAnsi="Wingdings" w:hint="default"/>
+        <w:sz w:val="20"/>
+      </w:rPr>
+    </w:lvl>
+    <w:lvl w:ilvl="4" w:tentative="1">
+      <w:start w:val="1"/>
+      <w:numFmt w:val="bullet"/>
+      <w:lvlText w:val=""/>
+      <w:lvlJc w:val="left"/>
+      <w:pPr>
+        <w:tabs>
+          <w:tab w:val="num" w:pos="3600"/>
+        </w:tabs>
+        <w:ind w:left="3600" w:hanging="360"/>
+      </w:pPr>
+      <w:rPr>
+        <w:rFonts w:ascii="Wingdings" w:hAnsi="Wingdings" w:hint="default"/>
+        <w:sz w:val="20"/>
+      </w:rPr>
+    </w:lvl>
+    <w:lvl w:ilvl="5" w:tentative="1">
+      <w:start w:val="1"/>
+      <w:numFmt w:val="bullet"/>
+      <w:lvlText w:val=""/>
+      <w:lvlJc w:val="left"/>
+      <w:pPr>
+        <w:tabs>
+          <w:tab w:val="num" w:pos="4320"/>
+        </w:tabs>
+        <w:ind w:left="4320" w:hanging="360"/>
+      </w:pPr>
+      <w:rPr>
+        <w:rFonts w:ascii="Wingdings" w:hAnsi="Wingdings" w:hint="default"/>
+        <w:sz w:val="20"/>
+      </w:rPr>
+    </w:lvl>
+    <w:lvl w:ilvl="6" w:tentative="1">
+      <w:start w:val="1"/>
+      <w:numFmt w:val="bullet"/>
+      <w:lvlText w:val=""/>
+      <w:lvlJc w:val="left"/>
+      <w:pPr>
+        <w:tabs>
+          <w:tab w:val="num" w:pos="5040"/>
+        </w:tabs>
+        <w:ind w:left="5040" w:hanging="360"/>
+      </w:pPr>
+      <w:rPr>
+        <w:rFonts w:ascii="Wingdings" w:hAnsi="Wingdings" w:hint="default"/>
+        <w:sz w:val="20"/>
+      </w:rPr>
+    </w:lvl>
+    <w:lvl w:ilvl="7" w:tentative="1">
+      <w:start w:val="1"/>
+      <w:numFmt w:val="bullet"/>
+      <w:lvlText w:val=""/>
+      <w:lvlJc w:val="left"/>
+      <w:pPr>
+        <w:tabs>
+          <w:tab w:val="num" w:pos="5760"/>
+        </w:tabs>
+        <w:ind w:left="5760" w:hanging="360"/>
+      </w:pPr>
+      <w:rPr>
+        <w:rFonts w:ascii="Wingdings" w:hAnsi="Wingdings" w:hint="default"/>
+        <w:sz w:val="20"/>
+      </w:rPr>
+    </w:lvl>
+    <w:lvl w:ilvl="8" w:tentative="1">
+      <w:start w:val="1"/>
+      <w:numFmt w:val="bullet"/>
+      <w:lvlText w:val=""/>
+      <w:lvlJc w:val="left"/>
+      <w:pPr>
+        <w:tabs>
+          <w:tab w:val="num" w:pos="6480"/>
+        </w:tabs>
+        <w:ind w:left="6480" w:hanging="360"/>
+      </w:pPr>
+      <w:rPr>
+        <w:rFonts w:ascii="Wingdings" w:hAnsi="Wingdings" w:hint="default"/>
+        <w:sz w:val="20"/>
+      </w:rPr>
+    </w:lvl>
+  </w:abstractNum>
+  <w:abstractNum w:abstractNumId="2" w15:restartNumberingAfterBreak="0">
     <w:nsid w:val="0B8A5384"/>
     <w:multiLevelType w:val="multilevel"/>
     <w:tmpl w:val="670001A4"/>
@@ -4773,7 +6125,7 @@
       </w:rPr>
     </w:lvl>
   </w:abstractNum>
-  <w:abstractNum w:abstractNumId="2" w15:restartNumberingAfterBreak="0">
+  <w:abstractNum w:abstractNumId="3" w15:restartNumberingAfterBreak="0">
     <w:nsid w:val="0C137648"/>
     <w:multiLevelType w:val="multilevel"/>
     <w:tmpl w:val="14A2D9B0"/>
@@ -4922,7 +6274,7 @@
       </w:rPr>
     </w:lvl>
   </w:abstractNum>
-  <w:abstractNum w:abstractNumId="3" w15:restartNumberingAfterBreak="0">
+  <w:abstractNum w:abstractNumId="4" w15:restartNumberingAfterBreak="0">
     <w:nsid w:val="11052FF3"/>
     <w:multiLevelType w:val="multilevel"/>
     <w:tmpl w:val="6AF6C484"/>
@@ -5035,7 +6387,7 @@
       </w:pPr>
     </w:lvl>
   </w:abstractNum>
-  <w:abstractNum w:abstractNumId="4" w15:restartNumberingAfterBreak="0">
+  <w:abstractNum w:abstractNumId="5" w15:restartNumberingAfterBreak="0">
     <w:nsid w:val="2BB91238"/>
     <w:multiLevelType w:val="multilevel"/>
     <w:tmpl w:val="2EDC302A"/>
@@ -5184,7 +6536,152 @@
       </w:rPr>
     </w:lvl>
   </w:abstractNum>
-  <w:abstractNum w:abstractNumId="5" w15:restartNumberingAfterBreak="0">
+  <w:abstractNum w:abstractNumId="6" w15:restartNumberingAfterBreak="0">
+    <w:nsid w:val="3086488B"/>
+    <w:multiLevelType w:val="multilevel"/>
+    <w:tmpl w:val="80245212"/>
+    <w:lvl w:ilvl="0">
+      <w:start w:val="1"/>
+      <w:numFmt w:val="bullet"/>
+      <w:lvlText w:val=""/>
+      <w:lvlJc w:val="left"/>
+      <w:pPr>
+        <w:tabs>
+          <w:tab w:val="num" w:pos="720"/>
+        </w:tabs>
+        <w:ind w:left="720" w:hanging="360"/>
+      </w:pPr>
+      <w:rPr>
+        <w:rFonts w:ascii="Symbol" w:hAnsi="Symbol" w:hint="default"/>
+        <w:sz w:val="20"/>
+      </w:rPr>
+    </w:lvl>
+    <w:lvl w:ilvl="1">
+      <w:start w:val="1"/>
+      <w:numFmt w:val="decimal"/>
+      <w:lvlText w:val="%2."/>
+      <w:lvlJc w:val="left"/>
+      <w:pPr>
+        <w:tabs>
+          <w:tab w:val="num" w:pos="1440"/>
+        </w:tabs>
+        <w:ind w:left="1440" w:hanging="360"/>
+      </w:pPr>
+    </w:lvl>
+    <w:lvl w:ilvl="2" w:tentative="1">
+      <w:start w:val="1"/>
+      <w:numFmt w:val="bullet"/>
+      <w:lvlText w:val=""/>
+      <w:lvlJc w:val="left"/>
+      <w:pPr>
+        <w:tabs>
+          <w:tab w:val="num" w:pos="2160"/>
+        </w:tabs>
+        <w:ind w:left="2160" w:hanging="360"/>
+      </w:pPr>
+      <w:rPr>
+        <w:rFonts w:ascii="Wingdings" w:hAnsi="Wingdings" w:hint="default"/>
+        <w:sz w:val="20"/>
+      </w:rPr>
+    </w:lvl>
+    <w:lvl w:ilvl="3" w:tentative="1">
+      <w:start w:val="1"/>
+      <w:numFmt w:val="bullet"/>
+      <w:lvlText w:val=""/>
+      <w:lvlJc w:val="left"/>
+      <w:pPr>
+        <w:tabs>
+          <w:tab w:val="num" w:pos="2880"/>
+        </w:tabs>
+        <w:ind w:left="2880" w:hanging="360"/>
+      </w:pPr>
+      <w:rPr>
+        <w:rFonts w:ascii="Wingdings" w:hAnsi="Wingdings" w:hint="default"/>
+        <w:sz w:val="20"/>
+      </w:rPr>
+    </w:lvl>
+    <w:lvl w:ilvl="4" w:tentative="1">
+      <w:start w:val="1"/>
+      <w:numFmt w:val="bullet"/>
+      <w:lvlText w:val=""/>
+      <w:lvlJc w:val="left"/>
+      <w:pPr>
+        <w:tabs>
+          <w:tab w:val="num" w:pos="3600"/>
+        </w:tabs>
+        <w:ind w:left="3600" w:hanging="360"/>
+      </w:pPr>
+      <w:rPr>
+        <w:rFonts w:ascii="Wingdings" w:hAnsi="Wingdings" w:hint="default"/>
+        <w:sz w:val="20"/>
+      </w:rPr>
+    </w:lvl>
+    <w:lvl w:ilvl="5" w:tentative="1">
+      <w:start w:val="1"/>
+      <w:numFmt w:val="bullet"/>
+      <w:lvlText w:val=""/>
+      <w:lvlJc w:val="left"/>
+      <w:pPr>
+        <w:tabs>
+          <w:tab w:val="num" w:pos="4320"/>
+        </w:tabs>
+        <w:ind w:left="4320" w:hanging="360"/>
+      </w:pPr>
+      <w:rPr>
+        <w:rFonts w:ascii="Wingdings" w:hAnsi="Wingdings" w:hint="default"/>
+        <w:sz w:val="20"/>
+      </w:rPr>
+    </w:lvl>
+    <w:lvl w:ilvl="6" w:tentative="1">
+      <w:start w:val="1"/>
+      <w:numFmt w:val="bullet"/>
+      <w:lvlText w:val=""/>
+      <w:lvlJc w:val="left"/>
+      <w:pPr>
+        <w:tabs>
+          <w:tab w:val="num" w:pos="5040"/>
+        </w:tabs>
+        <w:ind w:left="5040" w:hanging="360"/>
+      </w:pPr>
+      <w:rPr>
+        <w:rFonts w:ascii="Wingdings" w:hAnsi="Wingdings" w:hint="default"/>
+        <w:sz w:val="20"/>
+      </w:rPr>
+    </w:lvl>
+    <w:lvl w:ilvl="7" w:tentative="1">
+      <w:start w:val="1"/>
+      <w:numFmt w:val="bullet"/>
+      <w:lvlText w:val=""/>
+      <w:lvlJc w:val="left"/>
+      <w:pPr>
+        <w:tabs>
+          <w:tab w:val="num" w:pos="5760"/>
+        </w:tabs>
+        <w:ind w:left="5760" w:hanging="360"/>
+      </w:pPr>
+      <w:rPr>
+        <w:rFonts w:ascii="Wingdings" w:hAnsi="Wingdings" w:hint="default"/>
+        <w:sz w:val="20"/>
+      </w:rPr>
+    </w:lvl>
+    <w:lvl w:ilvl="8" w:tentative="1">
+      <w:start w:val="1"/>
+      <w:numFmt w:val="bullet"/>
+      <w:lvlText w:val=""/>
+      <w:lvlJc w:val="left"/>
+      <w:pPr>
+        <w:tabs>
+          <w:tab w:val="num" w:pos="6480"/>
+        </w:tabs>
+        <w:ind w:left="6480" w:hanging="360"/>
+      </w:pPr>
+      <w:rPr>
+        <w:rFonts w:ascii="Wingdings" w:hAnsi="Wingdings" w:hint="default"/>
+        <w:sz w:val="20"/>
+      </w:rPr>
+    </w:lvl>
+  </w:abstractNum>
+  <w:abstractNum w:abstractNumId="7" w15:restartNumberingAfterBreak="0">
     <w:nsid w:val="317A4DC5"/>
     <w:multiLevelType w:val="multilevel"/>
     <w:tmpl w:val="722A19E2"/>
@@ -5297,7 +6794,7 @@
       </w:pPr>
     </w:lvl>
   </w:abstractNum>
-  <w:abstractNum w:abstractNumId="6" w15:restartNumberingAfterBreak="0">
+  <w:abstractNum w:abstractNumId="8" w15:restartNumberingAfterBreak="0">
     <w:nsid w:val="31F66FE9"/>
     <w:multiLevelType w:val="multilevel"/>
     <w:tmpl w:val="0D828A0E"/>
@@ -5446,7 +6943,7 @@
       </w:rPr>
     </w:lvl>
   </w:abstractNum>
-  <w:abstractNum w:abstractNumId="7" w15:restartNumberingAfterBreak="0">
+  <w:abstractNum w:abstractNumId="9" w15:restartNumberingAfterBreak="0">
     <w:nsid w:val="3D9A7543"/>
     <w:multiLevelType w:val="multilevel"/>
     <w:tmpl w:val="A09ABC26"/>
@@ -5591,7 +7088,7 @@
       </w:rPr>
     </w:lvl>
   </w:abstractNum>
-  <w:abstractNum w:abstractNumId="8" w15:restartNumberingAfterBreak="0">
+  <w:abstractNum w:abstractNumId="10" w15:restartNumberingAfterBreak="0">
     <w:nsid w:val="470437A9"/>
     <w:multiLevelType w:val="multilevel"/>
     <w:tmpl w:val="1D44188C"/>
@@ -5740,7 +7237,7 @@
       </w:rPr>
     </w:lvl>
   </w:abstractNum>
-  <w:abstractNum w:abstractNumId="9" w15:restartNumberingAfterBreak="0">
+  <w:abstractNum w:abstractNumId="11" w15:restartNumberingAfterBreak="0">
     <w:nsid w:val="49DC3BD5"/>
     <w:multiLevelType w:val="multilevel"/>
     <w:tmpl w:val="171CCB5A"/>
@@ -5889,7 +7386,7 @@
       </w:rPr>
     </w:lvl>
   </w:abstractNum>
-  <w:abstractNum w:abstractNumId="10" w15:restartNumberingAfterBreak="0">
+  <w:abstractNum w:abstractNumId="12" w15:restartNumberingAfterBreak="0">
     <w:nsid w:val="4E4D2BB1"/>
     <w:multiLevelType w:val="multilevel"/>
     <w:tmpl w:val="D78247CC"/>
@@ -6002,7 +7499,7 @@
       </w:pPr>
     </w:lvl>
   </w:abstractNum>
-  <w:abstractNum w:abstractNumId="11" w15:restartNumberingAfterBreak="0">
+  <w:abstractNum w:abstractNumId="13" w15:restartNumberingAfterBreak="0">
     <w:nsid w:val="5A621D5E"/>
     <w:multiLevelType w:val="multilevel"/>
     <w:tmpl w:val="A4F6E592"/>
@@ -6151,7 +7648,7 @@
       </w:rPr>
     </w:lvl>
   </w:abstractNum>
-  <w:abstractNum w:abstractNumId="12" w15:restartNumberingAfterBreak="0">
+  <w:abstractNum w:abstractNumId="14" w15:restartNumberingAfterBreak="0">
     <w:nsid w:val="65AF2A69"/>
     <w:multiLevelType w:val="multilevel"/>
     <w:tmpl w:val="79948DB0"/>
@@ -6268,7 +7765,7 @@
       </w:pPr>
     </w:lvl>
   </w:abstractNum>
-  <w:abstractNum w:abstractNumId="13" w15:restartNumberingAfterBreak="0">
+  <w:abstractNum w:abstractNumId="15" w15:restartNumberingAfterBreak="0">
     <w:nsid w:val="6E5B7885"/>
     <w:multiLevelType w:val="multilevel"/>
     <w:tmpl w:val="A94E9DE8"/>
@@ -6381,7 +7878,7 @@
       </w:pPr>
     </w:lvl>
   </w:abstractNum>
-  <w:abstractNum w:abstractNumId="14" w15:restartNumberingAfterBreak="0">
+  <w:abstractNum w:abstractNumId="16" w15:restartNumberingAfterBreak="0">
     <w:nsid w:val="701F1F49"/>
     <w:multiLevelType w:val="multilevel"/>
     <w:tmpl w:val="C022503E"/>
@@ -6530,7 +8027,7 @@
       </w:rPr>
     </w:lvl>
   </w:abstractNum>
-  <w:abstractNum w:abstractNumId="15" w15:restartNumberingAfterBreak="0">
+  <w:abstractNum w:abstractNumId="17" w15:restartNumberingAfterBreak="0">
     <w:nsid w:val="799E6C5C"/>
     <w:multiLevelType w:val="multilevel"/>
     <w:tmpl w:val="B5CE2CC4"/>
@@ -6651,7 +8148,128 @@
       </w:pPr>
     </w:lvl>
   </w:abstractNum>
-  <w:abstractNum w:abstractNumId="16" w15:restartNumberingAfterBreak="0">
+  <w:abstractNum w:abstractNumId="18" w15:restartNumberingAfterBreak="0">
+    <w:nsid w:val="7CEB09C5"/>
+    <w:multiLevelType w:val="multilevel"/>
+    <w:tmpl w:val="DC82FB9E"/>
+    <w:lvl w:ilvl="0">
+      <w:start w:val="1"/>
+      <w:numFmt w:val="decimal"/>
+      <w:lvlText w:val="%1."/>
+      <w:lvlJc w:val="left"/>
+      <w:pPr>
+        <w:tabs>
+          <w:tab w:val="num" w:pos="720"/>
+        </w:tabs>
+        <w:ind w:left="720" w:hanging="360"/>
+      </w:pPr>
+    </w:lvl>
+    <w:lvl w:ilvl="1">
+      <w:start w:val="1"/>
+      <w:numFmt w:val="bullet"/>
+      <w:lvlText w:val="o"/>
+      <w:lvlJc w:val="left"/>
+      <w:pPr>
+        <w:tabs>
+          <w:tab w:val="num" w:pos="1440"/>
+        </w:tabs>
+        <w:ind w:left="1440" w:hanging="360"/>
+      </w:pPr>
+      <w:rPr>
+        <w:rFonts w:ascii="Courier New" w:hAnsi="Courier New" w:hint="default"/>
+        <w:sz w:val="20"/>
+      </w:rPr>
+    </w:lvl>
+    <w:lvl w:ilvl="2">
+      <w:start w:val="1"/>
+      <w:numFmt w:val="bullet"/>
+      <w:lvlText w:val=""/>
+      <w:lvlJc w:val="left"/>
+      <w:pPr>
+        <w:tabs>
+          <w:tab w:val="num" w:pos="2160"/>
+        </w:tabs>
+        <w:ind w:left="2160" w:hanging="360"/>
+      </w:pPr>
+      <w:rPr>
+        <w:rFonts w:ascii="Wingdings" w:hAnsi="Wingdings" w:hint="default"/>
+        <w:sz w:val="20"/>
+      </w:rPr>
+    </w:lvl>
+    <w:lvl w:ilvl="3" w:tentative="1">
+      <w:start w:val="1"/>
+      <w:numFmt w:val="decimal"/>
+      <w:lvlText w:val="%4."/>
+      <w:lvlJc w:val="left"/>
+      <w:pPr>
+        <w:tabs>
+          <w:tab w:val="num" w:pos="2880"/>
+        </w:tabs>
+        <w:ind w:left="2880" w:hanging="360"/>
+      </w:pPr>
+    </w:lvl>
+    <w:lvl w:ilvl="4" w:tentative="1">
+      <w:start w:val="1"/>
+      <w:numFmt w:val="decimal"/>
+      <w:lvlText w:val="%5."/>
+      <w:lvlJc w:val="left"/>
+      <w:pPr>
+        <w:tabs>
+          <w:tab w:val="num" w:pos="3600"/>
+        </w:tabs>
+        <w:ind w:left="3600" w:hanging="360"/>
+      </w:pPr>
+    </w:lvl>
+    <w:lvl w:ilvl="5" w:tentative="1">
+      <w:start w:val="1"/>
+      <w:numFmt w:val="decimal"/>
+      <w:lvlText w:val="%6."/>
+      <w:lvlJc w:val="left"/>
+      <w:pPr>
+        <w:tabs>
+          <w:tab w:val="num" w:pos="4320"/>
+        </w:tabs>
+        <w:ind w:left="4320" w:hanging="360"/>
+      </w:pPr>
+    </w:lvl>
+    <w:lvl w:ilvl="6" w:tentative="1">
+      <w:start w:val="1"/>
+      <w:numFmt w:val="decimal"/>
+      <w:lvlText w:val="%7."/>
+      <w:lvlJc w:val="left"/>
+      <w:pPr>
+        <w:tabs>
+          <w:tab w:val="num" w:pos="5040"/>
+        </w:tabs>
+        <w:ind w:left="5040" w:hanging="360"/>
+      </w:pPr>
+    </w:lvl>
+    <w:lvl w:ilvl="7" w:tentative="1">
+      <w:start w:val="1"/>
+      <w:numFmt w:val="decimal"/>
+      <w:lvlText w:val="%8."/>
+      <w:lvlJc w:val="left"/>
+      <w:pPr>
+        <w:tabs>
+          <w:tab w:val="num" w:pos="5760"/>
+        </w:tabs>
+        <w:ind w:left="5760" w:hanging="360"/>
+      </w:pPr>
+    </w:lvl>
+    <w:lvl w:ilvl="8" w:tentative="1">
+      <w:start w:val="1"/>
+      <w:numFmt w:val="decimal"/>
+      <w:lvlText w:val="%9."/>
+      <w:lvlJc w:val="left"/>
+      <w:pPr>
+        <w:tabs>
+          <w:tab w:val="num" w:pos="6480"/>
+        </w:tabs>
+        <w:ind w:left="6480" w:hanging="360"/>
+      </w:pPr>
+    </w:lvl>
+  </w:abstractNum>
+  <w:abstractNum w:abstractNumId="19" w15:restartNumberingAfterBreak="0">
     <w:nsid w:val="7EC52B40"/>
     <w:multiLevelType w:val="multilevel"/>
     <w:tmpl w:val="D80E0DFE"/>
@@ -6801,55 +8419,64 @@
     </w:lvl>
   </w:abstractNum>
   <w:num w:numId="1" w16cid:durableId="1521507229">
-    <w:abstractNumId w:val="7"/>
+    <w:abstractNumId w:val="9"/>
   </w:num>
   <w:num w:numId="2" w16cid:durableId="2012289253">
-    <w:abstractNumId w:val="9"/>
+    <w:abstractNumId w:val="11"/>
   </w:num>
   <w:num w:numId="3" w16cid:durableId="1589727213">
-    <w:abstractNumId w:val="10"/>
+    <w:abstractNumId w:val="12"/>
   </w:num>
   <w:num w:numId="4" w16cid:durableId="1887600176">
-    <w:abstractNumId w:val="2"/>
+    <w:abstractNumId w:val="3"/>
   </w:num>
   <w:num w:numId="5" w16cid:durableId="1470511734">
-    <w:abstractNumId w:val="14"/>
+    <w:abstractNumId w:val="16"/>
   </w:num>
   <w:num w:numId="6" w16cid:durableId="778372795">
-    <w:abstractNumId w:val="13"/>
+    <w:abstractNumId w:val="15"/>
   </w:num>
   <w:num w:numId="7" w16cid:durableId="53433280">
-    <w:abstractNumId w:val="4"/>
+    <w:abstractNumId w:val="5"/>
   </w:num>
   <w:num w:numId="8" w16cid:durableId="951742237">
-    <w:abstractNumId w:val="3"/>
+    <w:abstractNumId w:val="4"/>
   </w:num>
   <w:num w:numId="9" w16cid:durableId="132136124">
     <w:abstractNumId w:val="0"/>
   </w:num>
   <w:num w:numId="10" w16cid:durableId="1311984197">
+    <w:abstractNumId w:val="8"/>
+  </w:num>
+  <w:num w:numId="11" w16cid:durableId="1605112901">
+    <w:abstractNumId w:val="13"/>
+  </w:num>
+  <w:num w:numId="12" w16cid:durableId="698966369">
+    <w:abstractNumId w:val="7"/>
+  </w:num>
+  <w:num w:numId="13" w16cid:durableId="29377915">
+    <w:abstractNumId w:val="10"/>
+  </w:num>
+  <w:num w:numId="14" w16cid:durableId="931207769">
+    <w:abstractNumId w:val="2"/>
+  </w:num>
+  <w:num w:numId="15" w16cid:durableId="323047287">
+    <w:abstractNumId w:val="19"/>
+  </w:num>
+  <w:num w:numId="16" w16cid:durableId="1683437605">
+    <w:abstractNumId w:val="17"/>
+  </w:num>
+  <w:num w:numId="17" w16cid:durableId="11029999">
+    <w:abstractNumId w:val="14"/>
+  </w:num>
+  <w:num w:numId="18" w16cid:durableId="1490637334">
+    <w:abstractNumId w:val="1"/>
+  </w:num>
+  <w:num w:numId="19" w16cid:durableId="92825242">
     <w:abstractNumId w:val="6"/>
   </w:num>
-  <w:num w:numId="11" w16cid:durableId="1605112901">
-    <w:abstractNumId w:val="11"/>
-  </w:num>
-  <w:num w:numId="12" w16cid:durableId="698966369">
-    <w:abstractNumId w:val="5"/>
-  </w:num>
-  <w:num w:numId="13" w16cid:durableId="29377915">
-    <w:abstractNumId w:val="8"/>
-  </w:num>
-  <w:num w:numId="14" w16cid:durableId="931207769">
-    <w:abstractNumId w:val="1"/>
-  </w:num>
-  <w:num w:numId="15" w16cid:durableId="323047287">
-    <w:abstractNumId w:val="16"/>
-  </w:num>
-  <w:num w:numId="16" w16cid:durableId="1683437605">
-    <w:abstractNumId w:val="15"/>
-  </w:num>
-  <w:num w:numId="17" w16cid:durableId="11029999">
-    <w:abstractNumId w:val="12"/>
+  <w:num w:numId="20" w16cid:durableId="1323856240">
+    <w:abstractNumId w:val="18"/>
   </w:num>
 </w:numbering>
 </file>

</xml_diff>